<commit_message>
court(connsupct): motion-brief keeps its last paragraph with the signature, service certification whole, quotations spaced (fb-595.54.46)
Co-Authored-By: Claude Opus 5.5 <noreply@anthropic.com>
</commit_message>
<xml_diff>
--- a/courts/second-circuit/connecticut/state/supreme-court/motion-brief/usage/OUTPUT-motion-brief.docx
+++ b/courts/second-circuit/connecticut/state/supreme-court/motion-brief/usage/OUTPUT-motion-brief.docx
@@ -1001,7 +1001,7 @@
     </w:p>
     <w:p>
       <w:pPr>
-        <w:pStyle w:val="BodyText"/>
+        <w:pStyle w:val="BodyTextKeep"/>
       </w:pPr>
       <w:r>
         <w:t xml:space="preserve">WHEREFORE, defendants/​appellees Town of Bloomfield and Jonathan Sykes respectfully move the Court for leave to file a supplemental brief.</w:t>
@@ -1009,6 +1009,8 @@
     </w:p>
     <w:p>
       <w:pPr>
+        <w:keepNext/>
+        <w:keepLines/>
         <w:spacing w:before="0" w:after="0" w:line="288" w:lineRule="exact"/>
       </w:pPr>
     </w:p>
@@ -1618,320 +1620,376 @@
         <w:t xml:space="preserve">SERVICE</w:t>
       </w:r>
     </w:p>
-    <w:p>
-      <w:pPr>
-        <w:spacing w:before="0" w:after="0" w:line="414" w:lineRule="exact"/>
-        <w:ind w:left="0" w:firstLine="0"/>
-        <w:jc w:val="left"/>
-      </w:pPr>
-      <w:r>
-        <w:t xml:space="preserve">The</w:t>
-      </w:r>
-      <w:r>
-        <w:t xml:space="preserve"> </w:t>
-      </w:r>
-      <w:r>
-        <w:t xml:space="preserve">undersigned</w:t>
-      </w:r>
-      <w:r>
-        <w:t xml:space="preserve"> </w:t>
-      </w:r>
-      <w:r>
-        <w:t xml:space="preserve">certifies</w:t>
-      </w:r>
-      <w:r>
-        <w:t xml:space="preserve"> </w:t>
-      </w:r>
-      <w:r>
-        <w:t xml:space="preserve">that</w:t>
-      </w:r>
-      <w:r>
-        <w:t xml:space="preserve"> </w:t>
-      </w:r>
-      <w:r>
-        <w:t xml:space="preserve">a</w:t>
-      </w:r>
-      <w:r>
-        <w:t xml:space="preserve"> </w:t>
-      </w:r>
-      <w:r>
-        <w:t xml:space="preserve">copy</w:t>
-      </w:r>
-      <w:r>
-        <w:t xml:space="preserve"> </w:t>
-      </w:r>
-      <w:r>
-        <w:t xml:space="preserve">of</w:t>
-      </w:r>
-      <w:r>
-        <w:t xml:space="preserve"> </w:t>
-      </w:r>
-      <w:r>
-        <w:t xml:space="preserve">this</w:t>
-      </w:r>
-      <w:r>
-        <w:t xml:space="preserve"> </w:t>
-      </w:r>
-      <w:r>
-        <w:t xml:space="preserve">motion</w:t>
-      </w:r>
-      <w:r>
-        <w:t xml:space="preserve"> </w:t>
-      </w:r>
-      <w:r>
-        <w:t xml:space="preserve">has</w:t>
-      </w:r>
-      <w:r>
-        <w:t xml:space="preserve"> </w:t>
-      </w:r>
-      <w:r>
-        <w:t xml:space="preserve">been</w:t>
-      </w:r>
-      <w:r>
-        <w:t xml:space="preserve"> </w:t>
-      </w:r>
-      <w:r>
-        <w:t xml:space="preserve">delivered</w:t>
-      </w:r>
-      <w:r>
-        <w:t xml:space="preserve"> </w:t>
-      </w:r>
-      <w:r>
-        <w:t xml:space="preserve">electronically</w:t>
-      </w:r>
-      <w:r>
-        <w:t xml:space="preserve"> </w:t>
-      </w:r>
-      <w:r>
-        <w:t xml:space="preserve">on</w:t>
-      </w:r>
-      <w:r>
-        <w:t xml:space="preserve"> </w:t>
-      </w:r>
-      <w:r>
-        <w:t xml:space="preserve">October</w:t>
-      </w:r>
-      <w:r>
-        <w:t xml:space="preserve"> </w:t>
-      </w:r>
-      <w:r>
-        <w:t xml:space="preserve">26,</w:t>
-      </w:r>
-      <w:r>
-        <w:t xml:space="preserve"> </w:t>
-      </w:r>
-      <w:r>
-        <w:t xml:space="preserve">2022</w:t>
-      </w:r>
-      <w:r>
-        <w:t xml:space="preserve"> </w:t>
-      </w:r>
-      <w:r>
-        <w:t xml:space="preserve">to</w:t>
-      </w:r>
-      <w:r>
-        <w:t xml:space="preserve"> </w:t>
-      </w:r>
-      <w:r>
-        <w:t xml:space="preserve">each</w:t>
-      </w:r>
-      <w:r>
-        <w:t xml:space="preserve"> </w:t>
-      </w:r>
-      <w:r>
-        <w:t xml:space="preserve">counsel</w:t>
-      </w:r>
-      <w:r>
-        <w:t xml:space="preserve"> </w:t>
-      </w:r>
-      <w:r>
-        <w:t xml:space="preserve">of</w:t>
-      </w:r>
-      <w:r>
-        <w:t xml:space="preserve"> </w:t>
-      </w:r>
-      <w:r>
-        <w:t xml:space="preserve">record</w:t>
-      </w:r>
-      <w:r>
-        <w:t xml:space="preserve"> </w:t>
-      </w:r>
-      <w:r>
-        <w:t xml:space="preserve">listed</w:t>
-      </w:r>
-      <w:r>
-        <w:t xml:space="preserve"> </w:t>
-      </w:r>
-      <w:r>
-        <w:t xml:space="preserve">below,</w:t>
-      </w:r>
-      <w:r>
-        <w:t xml:space="preserve"> </w:t>
-      </w:r>
-      <w:r>
-        <w:t xml:space="preserve">in</w:t>
-      </w:r>
-      <w:r>
-        <w:t xml:space="preserve"> </w:t>
-      </w:r>
-      <w:r>
-        <w:t xml:space="preserve">compliance</w:t>
-      </w:r>
-      <w:r>
-        <w:t xml:space="preserve"> </w:t>
-      </w:r>
-      <w:r>
-        <w:t xml:space="preserve">with</w:t>
-      </w:r>
-      <w:r>
-        <w:t xml:space="preserve"> </w:t>
-      </w:r>
-      <w:r>
-        <w:t xml:space="preserve">Practice</w:t>
-      </w:r>
-      <w:r>
-        <w:t xml:space="preserve"> </w:t>
-      </w:r>
-      <w:r>
-        <w:t xml:space="preserve">Book</w:t>
-      </w:r>
-      <w:r>
-        <w:t xml:space="preserve"> </w:t>
-      </w:r>
-      <w:r>
-        <w:t xml:space="preserve">§</w:t>
-      </w:r>
-      <w:r>
-        <w:t xml:space="preserve"> </w:t>
-      </w:r>
-      <w:r>
-        <w:t xml:space="preserve">62</w:t>
-        <w:noBreakHyphen/>
-        <w:t xml:space="preserve">7.</w:t>
-      </w:r>
-    </w:p>
-    <w:p>
-      <w:pPr>
-        <w:spacing w:before="138" w:after="0" w:line="276" w:lineRule="exact"/>
-        <w:ind w:left="0" w:firstLine="0"/>
-        <w:jc w:val="left"/>
-      </w:pPr>
-      <w:r>
-        <w:t xml:space="preserve">John</w:t>
-      </w:r>
-      <w:r>
-        <w:t xml:space="preserve"> </w:t>
-      </w:r>
-      <w:r>
-        <w:t xml:space="preserve">A.</w:t>
-      </w:r>
-      <w:r>
-        <w:t xml:space="preserve"> </w:t>
-      </w:r>
-      <w:r>
-        <w:t xml:space="preserve">Sodipo,</w:t>
-      </w:r>
-      <w:r>
-        <w:t xml:space="preserve"> </w:t>
-      </w:r>
-      <w:r>
-        <w:t xml:space="preserve">Esq.,</w:t>
-      </w:r>
-      <w:r>
-        <w:t xml:space="preserve"> </w:t>
-      </w:r>
-      <w:r>
-        <w:t xml:space="preserve">john@sodipolg.com</w:t>
-      </w:r>
-      <w:r>
-        <w:t xml:space="preserve"> </w:t>
-      </w:r>
-      <w:r>
-        <w:t xml:space="preserve">(Sodipo</w:t>
-      </w:r>
-      <w:r>
-        <w:t xml:space="preserve"> </w:t>
-      </w:r>
-      <w:r>
-        <w:t xml:space="preserve">Law</w:t>
-      </w:r>
-      <w:r>
-        <w:t xml:space="preserve"> </w:t>
-      </w:r>
-      <w:r>
-        <w:t xml:space="preserve">Group,</w:t>
-      </w:r>
-      <w:r>
-        <w:t xml:space="preserve"> </w:t>
-      </w:r>
-      <w:r>
-        <w:t xml:space="preserve">P.C.,</w:t>
-      </w:r>
-      <w:r>
-        <w:t xml:space="preserve"> </w:t>
-      </w:r>
-      <w:r>
-        <w:t xml:space="preserve">120</w:t>
-      </w:r>
-      <w:r>
-        <w:t xml:space="preserve"> </w:t>
-      </w:r>
-      <w:r>
-        <w:t xml:space="preserve">Oxford</w:t>
-      </w:r>
-      <w:r>
-        <w:t xml:space="preserve"> </w:t>
-      </w:r>
-      <w:r>
-        <w:t xml:space="preserve">Street,</w:t>
-      </w:r>
-      <w:r>
-        <w:t xml:space="preserve"> </w:t>
-      </w:r>
-      <w:r>
-        <w:t xml:space="preserve">Hartford,</w:t>
-      </w:r>
-      <w:r>
-        <w:t xml:space="preserve"> </w:t>
-      </w:r>
-      <w:r>
-        <w:t xml:space="preserve">CT</w:t>
-      </w:r>
-      <w:r>
-        <w:t xml:space="preserve"> </w:t>
-      </w:r>
-      <w:r>
-        <w:t xml:space="preserve">06105)</w:t>
-      </w:r>
-    </w:p>
-    <w:p>
-      <w:pPr>
-        <w:spacing w:before="288" w:after="0" w:line="276" w:lineRule="exact"/>
-        <w:ind w:left="0" w:right="2160" w:firstLine="0"/>
-        <w:jc w:val="left"/>
-      </w:pPr>
-      <w:r>
-        <w:t xml:space="preserve">/s/</w:t>
-      </w:r>
-      <w:r>
-        <w:t xml:space="preserve"> </w:t>
-      </w:r>
-      <w:r>
-        <w:t xml:space="preserve">Dennis</w:t>
-      </w:r>
-      <w:r>
-        <w:t xml:space="preserve"> </w:t>
-      </w:r>
-      <w:r>
-        <w:t xml:space="preserve">M.</w:t>
-      </w:r>
-      <w:r>
-        <w:t xml:space="preserve"> </w:t>
-      </w:r>
-      <w:r>
-        <w:t xml:space="preserve">Durao</w:t>
-      </w:r>
-    </w:p>
+    <w:tbl>
+      <w:tblPr>
+        <w:tblW w:w="7920" w:type="dxa"/>
+        <w:tblLayout w:type="fixed"/>
+        <w:tblCellMar>
+          <w:top w:w="0" w:type="dxa"/>
+          <w:left w:w="0" w:type="dxa"/>
+          <w:bottom w:w="0" w:type="dxa"/>
+          <w:right w:w="0" w:type="dxa"/>
+        </w:tblCellMar>
+        <w:tblLook w:val="0000" w:firstRow="0" w:lastRow="0" w:firstColumn="0" w:lastColumn="0" w:noHBand="0" w:noVBand="0"/>
+      </w:tblPr>
+      <w:tblGrid>
+        <w:gridCol w:w="7920"/>
+      </w:tblGrid>
+      <w:tr>
+        <w:trPr>
+          <w:cantSplit/>
+        </w:trPr>
+        <w:tc>
+          <w:tcPr>
+            <w:tcW w:w="7920" w:type="dxa"/>
+          </w:tcPr>
+          <w:p>
+            <w:pPr>
+              <w:spacing w:before="0" w:after="0" w:line="414" w:lineRule="exact"/>
+              <w:ind w:left="0" w:firstLine="0"/>
+              <w:jc w:val="left"/>
+            </w:pPr>
+            <w:r>
+              <w:t xml:space="preserve">The</w:t>
+            </w:r>
+            <w:r>
+              <w:t xml:space="preserve"> </w:t>
+            </w:r>
+            <w:r>
+              <w:t xml:space="preserve">undersigned</w:t>
+            </w:r>
+            <w:r>
+              <w:t xml:space="preserve"> </w:t>
+            </w:r>
+            <w:r>
+              <w:t xml:space="preserve">certifies</w:t>
+            </w:r>
+            <w:r>
+              <w:t xml:space="preserve"> </w:t>
+            </w:r>
+            <w:r>
+              <w:t xml:space="preserve">that</w:t>
+            </w:r>
+            <w:r>
+              <w:t xml:space="preserve"> </w:t>
+            </w:r>
+            <w:r>
+              <w:t xml:space="preserve">a</w:t>
+            </w:r>
+            <w:r>
+              <w:t xml:space="preserve"> </w:t>
+            </w:r>
+            <w:r>
+              <w:t xml:space="preserve">copy</w:t>
+            </w:r>
+            <w:r>
+              <w:t xml:space="preserve"> </w:t>
+            </w:r>
+            <w:r>
+              <w:t xml:space="preserve">of</w:t>
+            </w:r>
+            <w:r>
+              <w:t xml:space="preserve"> </w:t>
+            </w:r>
+            <w:r>
+              <w:t xml:space="preserve">this</w:t>
+            </w:r>
+            <w:r>
+              <w:t xml:space="preserve"> </w:t>
+            </w:r>
+            <w:r>
+              <w:t xml:space="preserve">motion</w:t>
+            </w:r>
+            <w:r>
+              <w:t xml:space="preserve"> </w:t>
+            </w:r>
+            <w:r>
+              <w:t xml:space="preserve">has</w:t>
+            </w:r>
+            <w:r>
+              <w:t xml:space="preserve"> </w:t>
+            </w:r>
+            <w:r>
+              <w:t xml:space="preserve">been</w:t>
+            </w:r>
+            <w:r>
+              <w:t xml:space="preserve"> </w:t>
+            </w:r>
+            <w:r>
+              <w:t xml:space="preserve">delivered</w:t>
+            </w:r>
+            <w:r>
+              <w:t xml:space="preserve"> </w:t>
+            </w:r>
+            <w:r>
+              <w:t xml:space="preserve">electronically</w:t>
+            </w:r>
+            <w:r>
+              <w:t xml:space="preserve"> </w:t>
+            </w:r>
+            <w:r>
+              <w:t xml:space="preserve">on</w:t>
+            </w:r>
+            <w:r>
+              <w:t xml:space="preserve"> </w:t>
+            </w:r>
+            <w:r>
+              <w:t xml:space="preserve">October</w:t>
+            </w:r>
+            <w:r>
+              <w:t xml:space="preserve"> </w:t>
+            </w:r>
+            <w:r>
+              <w:t xml:space="preserve">26,</w:t>
+            </w:r>
+            <w:r>
+              <w:t xml:space="preserve"> </w:t>
+            </w:r>
+            <w:r>
+              <w:t xml:space="preserve">2022</w:t>
+            </w:r>
+            <w:r>
+              <w:t xml:space="preserve"> </w:t>
+            </w:r>
+            <w:r>
+              <w:t xml:space="preserve">to</w:t>
+            </w:r>
+            <w:r>
+              <w:t xml:space="preserve"> </w:t>
+            </w:r>
+            <w:r>
+              <w:t xml:space="preserve">each</w:t>
+            </w:r>
+            <w:r>
+              <w:t xml:space="preserve"> </w:t>
+            </w:r>
+            <w:r>
+              <w:t xml:space="preserve">counsel</w:t>
+            </w:r>
+            <w:r>
+              <w:t xml:space="preserve"> </w:t>
+            </w:r>
+            <w:r>
+              <w:t xml:space="preserve">of</w:t>
+            </w:r>
+            <w:r>
+              <w:t xml:space="preserve"> </w:t>
+            </w:r>
+            <w:r>
+              <w:t xml:space="preserve">record</w:t>
+            </w:r>
+            <w:r>
+              <w:t xml:space="preserve"> </w:t>
+            </w:r>
+            <w:r>
+              <w:t xml:space="preserve">listed</w:t>
+            </w:r>
+            <w:r>
+              <w:t xml:space="preserve"> </w:t>
+            </w:r>
+            <w:r>
+              <w:t xml:space="preserve">below</w:t>
+            </w:r>
+            <w:r>
+              <w:t xml:space="preserve"> </w:t>
+            </w:r>
+            <w:r>
+              <w:t xml:space="preserve">(on</w:t>
+            </w:r>
+            <w:r>
+              <w:t xml:space="preserve"> </w:t>
+            </w:r>
+            <w:r>
+              <w:t xml:space="preserve">paper</w:t>
+            </w:r>
+            <w:r>
+              <w:t xml:space="preserve"> </w:t>
+            </w:r>
+            <w:r>
+              <w:t xml:space="preserve">where</w:t>
+            </w:r>
+            <w:r>
+              <w:t xml:space="preserve"> </w:t>
+            </w:r>
+            <w:r>
+              <w:t xml:space="preserve">so</w:t>
+            </w:r>
+            <w:r>
+              <w:t xml:space="preserve"> </w:t>
+            </w:r>
+            <w:r>
+              <w:t xml:space="preserve">stated),</w:t>
+            </w:r>
+            <w:r>
+              <w:t xml:space="preserve"> </w:t>
+            </w:r>
+            <w:r>
+              <w:t xml:space="preserve">in</w:t>
+            </w:r>
+            <w:r>
+              <w:t xml:space="preserve"> </w:t>
+            </w:r>
+            <w:r>
+              <w:t xml:space="preserve">compliance</w:t>
+            </w:r>
+            <w:r>
+              <w:t xml:space="preserve"> </w:t>
+            </w:r>
+            <w:r>
+              <w:t xml:space="preserve">with</w:t>
+            </w:r>
+            <w:r>
+              <w:t xml:space="preserve"> </w:t>
+            </w:r>
+            <w:r>
+              <w:t xml:space="preserve">Practice</w:t>
+            </w:r>
+            <w:r>
+              <w:t xml:space="preserve"> </w:t>
+            </w:r>
+            <w:r>
+              <w:t xml:space="preserve">Book</w:t>
+            </w:r>
+            <w:r>
+              <w:t xml:space="preserve"> </w:t>
+            </w:r>
+            <w:r>
+              <w:t xml:space="preserve">§</w:t>
+            </w:r>
+            <w:r>
+              <w:t xml:space="preserve"> </w:t>
+            </w:r>
+            <w:r>
+              <w:t xml:space="preserve">62</w:t>
+              <w:noBreakHyphen/>
+              <w:t xml:space="preserve">7.</w:t>
+            </w:r>
+          </w:p>
+          <w:p>
+            <w:pPr>
+              <w:spacing w:before="138" w:after="0" w:line="276" w:lineRule="exact"/>
+              <w:ind w:left="0" w:firstLine="0"/>
+              <w:jc w:val="left"/>
+            </w:pPr>
+            <w:r>
+              <w:t xml:space="preserve">John</w:t>
+            </w:r>
+            <w:r>
+              <w:t xml:space="preserve"> </w:t>
+            </w:r>
+            <w:r>
+              <w:t xml:space="preserve">A.</w:t>
+            </w:r>
+            <w:r>
+              <w:t xml:space="preserve"> </w:t>
+            </w:r>
+            <w:r>
+              <w:t xml:space="preserve">Sodipo,</w:t>
+            </w:r>
+            <w:r>
+              <w:t xml:space="preserve"> </w:t>
+            </w:r>
+            <w:r>
+              <w:t xml:space="preserve">Esq.,</w:t>
+            </w:r>
+            <w:r>
+              <w:t xml:space="preserve"> </w:t>
+            </w:r>
+            <w:r>
+              <w:t xml:space="preserve">john@sodipolg.com</w:t>
+            </w:r>
+            <w:r>
+              <w:t xml:space="preserve"> </w:t>
+            </w:r>
+            <w:r>
+              <w:t xml:space="preserve">(Sodipo</w:t>
+            </w:r>
+            <w:r>
+              <w:t xml:space="preserve"> </w:t>
+            </w:r>
+            <w:r>
+              <w:t xml:space="preserve">Law</w:t>
+            </w:r>
+            <w:r>
+              <w:t xml:space="preserve"> </w:t>
+            </w:r>
+            <w:r>
+              <w:t xml:space="preserve">Group,</w:t>
+            </w:r>
+            <w:r>
+              <w:t xml:space="preserve"> </w:t>
+            </w:r>
+            <w:r>
+              <w:t xml:space="preserve">P.C.,</w:t>
+            </w:r>
+            <w:r>
+              <w:t xml:space="preserve"> </w:t>
+            </w:r>
+            <w:r>
+              <w:t xml:space="preserve">120</w:t>
+            </w:r>
+            <w:r>
+              <w:t xml:space="preserve"> </w:t>
+            </w:r>
+            <w:r>
+              <w:t xml:space="preserve">Oxford</w:t>
+            </w:r>
+            <w:r>
+              <w:t xml:space="preserve"> </w:t>
+            </w:r>
+            <w:r>
+              <w:t xml:space="preserve">Street,</w:t>
+            </w:r>
+            <w:r>
+              <w:t xml:space="preserve"> </w:t>
+            </w:r>
+            <w:r>
+              <w:t xml:space="preserve">Hartford,</w:t>
+            </w:r>
+            <w:r>
+              <w:t xml:space="preserve"> </w:t>
+            </w:r>
+            <w:r>
+              <w:t xml:space="preserve">CT</w:t>
+            </w:r>
+            <w:r>
+              <w:t xml:space="preserve"> </w:t>
+            </w:r>
+            <w:r>
+              <w:t xml:space="preserve">06105)</w:t>
+            </w:r>
+          </w:p>
+          <w:p>
+            <w:pPr>
+              <w:spacing w:before="288" w:after="0" w:line="276" w:lineRule="exact"/>
+              <w:ind w:left="0" w:right="2160" w:firstLine="0"/>
+              <w:jc w:val="left"/>
+            </w:pPr>
+            <w:r>
+              <w:t xml:space="preserve">/s/</w:t>
+            </w:r>
+            <w:r>
+              <w:t xml:space="preserve"> </w:t>
+            </w:r>
+            <w:r>
+              <w:t xml:space="preserve">Dennis</w:t>
+            </w:r>
+            <w:r>
+              <w:t xml:space="preserve"> </w:t>
+            </w:r>
+            <w:r>
+              <w:t xml:space="preserve">M.</w:t>
+            </w:r>
+            <w:r>
+              <w:t xml:space="preserve"> </w:t>
+            </w:r>
+            <w:r>
+              <w:t xml:space="preserve">Durao</w:t>
+            </w:r>
+          </w:p>
+        </w:tc>
+      </w:tr>
+    </w:tbl>
     <w:sectPr>
       <w:footerReference w:type="default" r:id="rIdFooter1"/>
       <w:pgSz w:w="12240" w:h="15840"/>
@@ -2802,7 +2860,7 @@
     <w:basedOn w:val="Normal"/>
     <w:qFormat/>
     <w:pPr>
-      <w:spacing w:before="0" w:after="0" w:line="414" w:lineRule="exact"/>
+      <w:spacing w:before="138" w:after="138" w:line="414" w:lineRule="exact"/>
       <w:ind w:left="720" w:right="720" w:firstLine="0"/>
     </w:pPr>
   </w:style>
@@ -2811,7 +2869,7 @@
     <w:basedOn w:val="Normal"/>
     <w:qFormat/>
     <w:pPr>
-      <w:spacing w:before="0" w:after="0" w:line="414" w:lineRule="exact"/>
+      <w:spacing w:before="138" w:after="138" w:line="414" w:lineRule="exact"/>
       <w:ind w:left="720" w:right="720" w:firstLine="0"/>
     </w:pPr>
   </w:style>
@@ -2820,7 +2878,7 @@
     <w:basedOn w:val="Normal"/>
     <w:qFormat/>
     <w:pPr>
-      <w:spacing w:before="0" w:after="138" w:line="414" w:lineRule="exact"/>
+      <w:spacing w:before="138" w:after="138" w:line="414" w:lineRule="exact"/>
       <w:ind w:left="720" w:right="720" w:firstLine="0"/>
     </w:pPr>
   </w:style>
@@ -2829,7 +2887,7 @@
     <w:basedOn w:val="Normal"/>
     <w:qFormat/>
     <w:pPr>
-      <w:spacing w:before="0" w:after="138" w:line="414" w:lineRule="exact"/>
+      <w:spacing w:before="138" w:after="138" w:line="414" w:lineRule="exact"/>
       <w:ind w:left="720" w:right="720" w:firstLine="0"/>
     </w:pPr>
   </w:style>
@@ -2840,6 +2898,15 @@
     <w:pPr>
       <w:spacing w:before="0" w:after="0" w:line="276" w:lineRule="exact"/>
       <w:ind w:firstLine="0"/>
+    </w:pPr>
+  </w:style>
+  <w:style w:type="paragraph" w:customStyle="1" w:styleId="BodyTextKeep">
+    <w:name w:val="Body Text Keep"/>
+    <w:basedOn w:val="BodyText"/>
+    <w:qFormat/>
+    <w:pPr>
+      <w:keepNext/>
+      <w:keepLines/>
     </w:pPr>
   </w:style>
   <w:style w:type="paragraph" w:customStyle="1" w:styleId="XdList1">

</xml_diff>